<commit_message>
Guard ground floor slabs from grillage routing
</commit_message>
<xml_diff>
--- a/docs/Черновик_ТЗ_развитие_ИИ-сметчика_этап_2_2026-09-27.docx
+++ b/docs/Черновик_ТЗ_развитие_ИИ-сметчика_этап_2_2026-09-27.docx
@@ -22,7 +22,7 @@
     </w:p>
     <w:p>
       <w:r>
-        <w:t>Версия документа: 0.5 от 27.09.2026.</w:t>
+        <w:t>Версия документа: 0.6 от 27.09.2026.</w:t>
       </w:r>
     </w:p>
     <w:p>
@@ -562,6 +562,97 @@
       </w:r>
     </w:p>
     <w:p>
+      <w:r>
+        <w:t>Отдельное правило классификации плит:</w:t>
+      </w:r>
+    </w:p>
+    <w:p>
+      <w:pPr>
+        <w:pStyle w:val="ListBullet"/>
+      </w:pPr>
+      <w:r>
+        <w:rPr>
+          <w:rFonts w:ascii="Courier New" w:hAnsi="Courier New"/>
+          <w:color w:val="374151"/>
+          <w:sz w:val="19"/>
+        </w:rPr>
+        <w:t>foundation_slab</w:t>
+      </w:r>
+      <w:r>
+        <w:t xml:space="preserve"> — фундаментная плита, несущая фундаментная конструкция;</w:t>
+      </w:r>
+    </w:p>
+    <w:p>
+      <w:pPr>
+        <w:pStyle w:val="ListBullet"/>
+      </w:pPr>
+      <w:r>
+        <w:rPr>
+          <w:rFonts w:ascii="Courier New" w:hAnsi="Courier New"/>
+          <w:color w:val="374151"/>
+          <w:sz w:val="19"/>
+        </w:rPr>
+        <w:t>ground_floor_slab</w:t>
+      </w:r>
+      <w:r>
+        <w:t xml:space="preserve"> — плита основания пола по грунту/подготовленному основанию;</w:t>
+      </w:r>
+    </w:p>
+    <w:p>
+      <w:pPr>
+        <w:pStyle w:val="ListBullet"/>
+      </w:pPr>
+      <w:r>
+        <w:rPr>
+          <w:rFonts w:ascii="Courier New" w:hAnsi="Courier New"/>
+          <w:color w:val="374151"/>
+          <w:sz w:val="19"/>
+        </w:rPr>
+        <w:t>floor_slabs</w:t>
+      </w:r>
+      <w:r>
+        <w:t xml:space="preserve"> — надземные плиты перекрытия и покрытия.</w:t>
+      </w:r>
+    </w:p>
+    <w:p>
+      <w:r>
+        <w:t xml:space="preserve">Плита основания пола не включается автоматически в ростверк, фундаментную ленту, ребро плиты или надземное перекрытие. Эталоны: ЛВП — одна плита основания пола дома; АРХ — самостоятельные плиты пола дома и гаража; ЮРВ — плиты основания пола 300/250 мм. Каждая физическая плита сохраняется отдельным динамическим блоком. Если явный адаптер </w:t>
+      </w:r>
+      <w:r>
+        <w:rPr>
+          <w:rFonts w:ascii="Courier New" w:hAnsi="Courier New"/>
+          <w:color w:val="374151"/>
+          <w:sz w:val="19"/>
+        </w:rPr>
+        <w:t>ground_floor_slab</w:t>
+      </w:r>
+      <w:r>
+        <w:t xml:space="preserve"> ещё не реализован, система выводит </w:t>
+      </w:r>
+      <w:r>
+        <w:rPr>
+          <w:rFonts w:ascii="Courier New" w:hAnsi="Courier New"/>
+          <w:color w:val="374151"/>
+          <w:sz w:val="19"/>
+        </w:rPr>
+        <w:t>calculation_module_missing</w:t>
+      </w:r>
+      <w:r>
+        <w:t xml:space="preserve"> / </w:t>
+      </w:r>
+      <w:r>
+        <w:rPr>
+          <w:rFonts w:ascii="Courier New" w:hAnsi="Courier New"/>
+          <w:color w:val="374151"/>
+          <w:sz w:val="19"/>
+        </w:rPr>
+        <w:t>needs_review</w:t>
+      </w:r>
+      <w:r>
+        <w:t>, а не направляет конструкцию в ближайший раздел по слову «плита». Допускается переиспользование формул существующей фундаментной плиты через отдельный режим, но без объединения нескольких плит и без двойного учёта материалов с ростверком.</w:t>
+      </w:r>
+    </w:p>
+    <w:p>
       <w:pPr>
         <w:pStyle w:val="Heading3"/>
       </w:pPr>
@@ -1001,7 +1092,18 @@
     </w:p>
     <w:p>
       <w:r>
-        <w:t>Классификация выполняется по назначению, положению относительно плиты, геометрии и спецификации, а не только по названию раздела в старой смете. Термины «вверх» и «вниз» относятся к положению рёбер относительно фундаментной плиты, а не к отдельному виду стен.</w:t>
+        <w:t xml:space="preserve">Классификация выполняется по назначению, положению относительно плиты, геометрии и спецификации, а не только по названию раздела в старой смете. Термины «вверх» и «вниз» относятся к положению рёбер относительно фундаментной плиты, а не к отдельному виду стен. Плиты основания пола типа </w:t>
+      </w:r>
+      <w:r>
+        <w:rPr>
+          <w:rFonts w:ascii="Courier New" w:hAnsi="Courier New"/>
+          <w:color w:val="374151"/>
+          <w:sz w:val="19"/>
+        </w:rPr>
+        <w:t>ground_floor_slab</w:t>
+      </w:r>
+      <w:r>
+        <w:t xml:space="preserve"> прямо исключены из этого модуля.</w:t>
       </w:r>
     </w:p>
     <w:p>

</xml_diff>

<commit_message>
Document specification-based section titles
</commit_message>
<xml_diff>
--- a/docs/Черновик_ТЗ_развитие_ИИ-сметчика_этап_2_2026-09-27.docx
+++ b/docs/Черновик_ТЗ_развитие_ИИ-сметчика_этап_2_2026-09-27.docx
@@ -22,7 +22,7 @@
     </w:p>
     <w:p>
       <w:r>
-        <w:t>Версия документа: 0.6 от 27.09.2026.</w:t>
+        <w:t>Версия документа: 0.7 от 27.09.2026.</w:t>
       </w:r>
     </w:p>
     <w:p>
@@ -559,6 +559,292 @@
     <w:p>
       <w:r>
         <w:t>Жестко заданные номера строк конкретного эталонного проекта использовать нельзя.</w:t>
+      </w:r>
+    </w:p>
+    <w:p>
+      <w:r>
+        <w:t>Названия разделов и динамических блоков:</w:t>
+      </w:r>
+    </w:p>
+    <w:p>
+      <w:pPr>
+        <w:spacing w:after="60"/>
+        <w:ind w:left="369" w:hanging="369"/>
+      </w:pPr>
+      <w:r>
+        <w:rPr>
+          <w:b/>
+        </w:rPr>
+        <w:t xml:space="preserve">1. </w:t>
+      </w:r>
+      <w:r>
+        <w:t xml:space="preserve">Нейросеть классифицирует найденную конструкцию в технический </w:t>
+      </w:r>
+      <w:r>
+        <w:rPr>
+          <w:rFonts w:ascii="Courier New" w:hAnsi="Courier New"/>
+          <w:color w:val="374151"/>
+          <w:sz w:val="19"/>
+        </w:rPr>
+        <w:t>section_code</w:t>
+      </w:r>
+      <w:r>
+        <w:t>, но не</w:t>
+      </w:r>
+    </w:p>
+    <w:p>
+      <w:r>
+        <w:t>придумывает и не редактирует видимый заголовок раздела сметы.</w:t>
+      </w:r>
+    </w:p>
+    <w:p>
+      <w:pPr>
+        <w:spacing w:after="60"/>
+        <w:ind w:left="369" w:hanging="369"/>
+      </w:pPr>
+      <w:r>
+        <w:rPr>
+          <w:b/>
+        </w:rPr>
+        <w:t xml:space="preserve">2. </w:t>
+      </w:r>
+      <w:r>
+        <w:t>По умолчанию видимое название берётся дословно из заголовка спецификации или ведомости,</w:t>
+      </w:r>
+    </w:p>
+    <w:p>
+      <w:r>
+        <w:t>к которой относятся расчётные объёмы данного раздела или блока.</w:t>
+      </w:r>
+    </w:p>
+    <w:p>
+      <w:pPr>
+        <w:spacing w:after="60"/>
+        <w:ind w:left="369" w:hanging="369"/>
+      </w:pPr>
+      <w:r>
+        <w:rPr>
+          <w:b/>
+        </w:rPr>
+        <w:t xml:space="preserve">3. </w:t>
+      </w:r>
+      <w:r>
+        <w:t>Если отдельного заголовка спецификации нет, используется дословное название конструкции</w:t>
+      </w:r>
+    </w:p>
+    <w:p>
+      <w:r>
+        <w:t>на листе, заголовок листа/страницы или напечатанная проектная марка.</w:t>
+      </w:r>
+    </w:p>
+    <w:p>
+      <w:pPr>
+        <w:spacing w:after="60"/>
+        <w:ind w:left="369" w:hanging="369"/>
+      </w:pPr>
+      <w:r>
+        <w:rPr>
+          <w:b/>
+        </w:rPr>
+        <w:t xml:space="preserve">4. </w:t>
+      </w:r>
+      <w:r>
+        <w:t>Если проектного названия нет, применяется утверждённое каноническое название из</w:t>
+      </w:r>
+    </w:p>
+    <w:p>
+      <w:r>
+        <w:rPr>
+          <w:rFonts w:ascii="Courier New" w:hAnsi="Courier New"/>
+          <w:color w:val="374151"/>
+          <w:sz w:val="19"/>
+        </w:rPr>
+        <w:t>section_contract</w:t>
+      </w:r>
+      <w:r>
+        <w:t xml:space="preserve">/шаблона. Такое название имеет источник </w:t>
+      </w:r>
+      <w:r>
+        <w:rPr>
+          <w:rFonts w:ascii="Courier New" w:hAnsi="Courier New"/>
+          <w:color w:val="374151"/>
+          <w:sz w:val="19"/>
+        </w:rPr>
+        <w:t>contract_default</w:t>
+      </w:r>
+      <w:r>
+        <w:t>, а не AI.</w:t>
+      </w:r>
+    </w:p>
+    <w:p>
+      <w:pPr>
+        <w:spacing w:after="60"/>
+        <w:ind w:left="369" w:hanging="369"/>
+      </w:pPr>
+      <w:r>
+        <w:rPr>
+          <w:b/>
+        </w:rPr>
+        <w:t xml:space="preserve">5. </w:t>
+      </w:r>
+      <w:r>
+        <w:t>Ручное подтверждённое название сметчика имеет наивысший приоритет.</w:t>
+      </w:r>
+    </w:p>
+    <w:p>
+      <w:pPr>
+        <w:spacing w:after="60"/>
+        <w:ind w:left="369" w:hanging="369"/>
+      </w:pPr>
+      <w:r>
+        <w:rPr>
+          <w:b/>
+        </w:rPr>
+        <w:t xml:space="preserve">6. </w:t>
+      </w:r>
+      <w:r>
+        <w:t>Для каждого названия сохраняются исходный текст, итоговый отображаемый текст, источник</w:t>
+      </w:r>
+    </w:p>
+    <w:p>
+      <w:r>
+        <w:rPr>
+          <w:rFonts w:ascii="Courier New" w:hAnsi="Courier New"/>
+          <w:color w:val="374151"/>
+          <w:sz w:val="19"/>
+        </w:rPr>
+        <w:t>specification</w:t>
+      </w:r>
+      <w:r>
+        <w:t xml:space="preserve">, </w:t>
+      </w:r>
+      <w:r>
+        <w:rPr>
+          <w:rFonts w:ascii="Courier New" w:hAnsi="Courier New"/>
+          <w:color w:val="374151"/>
+          <w:sz w:val="19"/>
+        </w:rPr>
+        <w:t>sheet</w:t>
+      </w:r>
+      <w:r>
+        <w:t xml:space="preserve">, </w:t>
+      </w:r>
+      <w:r>
+        <w:rPr>
+          <w:rFonts w:ascii="Courier New" w:hAnsi="Courier New"/>
+          <w:color w:val="374151"/>
+          <w:sz w:val="19"/>
+        </w:rPr>
+        <w:t>contract_default</w:t>
+      </w:r>
+      <w:r>
+        <w:t xml:space="preserve"> или </w:t>
+      </w:r>
+      <w:r>
+        <w:rPr>
+          <w:rFonts w:ascii="Courier New" w:hAnsi="Courier New"/>
+          <w:color w:val="374151"/>
+          <w:sz w:val="19"/>
+        </w:rPr>
+        <w:t>manual</w:t>
+      </w:r>
+      <w:r>
+        <w:t>, а также PDF, страница и таблица.</w:t>
+      </w:r>
+    </w:p>
+    <w:p>
+      <w:pPr>
+        <w:spacing w:after="60"/>
+        <w:ind w:left="369" w:hanging="369"/>
+      </w:pPr>
+      <w:r>
+        <w:rPr>
+          <w:b/>
+        </w:rPr>
+        <w:t xml:space="preserve">7. </w:t>
+      </w:r>
+      <w:r>
+        <w:t>Допускается техническая очистка пробелов и переносов строк без изменения смысла. Нельзя</w:t>
+      </w:r>
+    </w:p>
+    <w:p>
+      <w:r>
+        <w:t>самостоятельно добавлять этаж, толщину, отметку или назначение, если их нет в выбранном исходном заголовке; эти параметры хранятся в отдельных полях.</w:t>
+      </w:r>
+    </w:p>
+    <w:p>
+      <w:pPr>
+        <w:spacing w:after="60"/>
+        <w:ind w:left="369" w:hanging="369"/>
+      </w:pPr>
+      <w:r>
+        <w:rPr>
+          <w:b/>
+        </w:rPr>
+        <w:t xml:space="preserve">8. </w:t>
+      </w:r>
+      <w:r>
+        <w:t>При нескольких конкурирующих названиях модель сохраняет варианты, устанавливает</w:t>
+      </w:r>
+    </w:p>
+    <w:p>
+      <w:r>
+        <w:rPr>
+          <w:rFonts w:ascii="Courier New" w:hAnsi="Courier New"/>
+          <w:color w:val="374151"/>
+          <w:sz w:val="19"/>
+        </w:rPr>
+        <w:t>needs_review</w:t>
+      </w:r>
+      <w:r>
+        <w:t xml:space="preserve"> и не склеивает новое название из фрагментов.</w:t>
+      </w:r>
+    </w:p>
+    <w:p>
+      <w:pPr>
+        <w:spacing w:after="60"/>
+        <w:ind w:left="369" w:hanging="369"/>
+      </w:pPr>
+      <w:r>
+        <w:rPr>
+          <w:b/>
+        </w:rPr>
+        <w:t xml:space="preserve">9. </w:t>
+      </w:r>
+      <w:r>
+        <w:t>Для повторяющихся конструкций каждая физическая группа получает собственное проектное</w:t>
+      </w:r>
+    </w:p>
+    <w:p>
+      <w:r>
+        <w:t xml:space="preserve">название. Наличие общего канонического </w:t>
+      </w:r>
+      <w:r>
+        <w:rPr>
+          <w:rFonts w:ascii="Courier New" w:hAnsi="Courier New"/>
+          <w:color w:val="374151"/>
+          <w:sz w:val="19"/>
+        </w:rPr>
+        <w:t>section_code</w:t>
+      </w:r>
+      <w:r>
+        <w:t xml:space="preserve"> не делает их заголовки одинаковыми.</w:t>
+      </w:r>
+    </w:p>
+    <w:p>
+      <w:r>
+        <w:t xml:space="preserve">Правила и результат проверки текущей реализации зафиксированы в отчёте </w:t>
+      </w:r>
+      <w:r>
+        <w:rPr>
+          <w:rFonts w:ascii="Courier New" w:hAnsi="Courier New"/>
+          <w:color w:val="374151"/>
+          <w:sz w:val="19"/>
+        </w:rPr>
+        <w:t>section_title_source_audit_2026-09-27.md</w:t>
+      </w:r>
+      <w:r>
+        <w:t>.</w:t>
       </w:r>
     </w:p>
     <w:p>

</xml_diff>